<commit_message>
Accept changes for recruitment scripts and thank you note
</commit_message>
<xml_diff>
--- a/StateOfPractice/MACREM-2026/SupportingDocuments/RecruitingScript.docx
+++ b/StateOfPractice/MACREM-2026/SupportingDocuments/RecruitingScript.docx
@@ -278,12 +278,6 @@
           <w:rFonts w:ascii="Arial" w:hAnsi="Arial" w:cs="Arial"/>
           <w:color w:val="000000"/>
           <w:sz w:val="20"/>
-          <w:rPrChange w:id="0" w:author="Spencer Smith" w:date="2026-06-18T22:12:00Z" w16du:dateUtc="2026-06-19T02:12:00Z">
-            <w:rPr>
-              <w:rFonts w:ascii="Arial" w:hAnsi="Arial" w:cs="Arial"/>
-              <w:sz w:val="20"/>
-            </w:rPr>
-          </w:rPrChange>
         </w:rPr>
       </w:pPr>
       <w:r>
@@ -385,108 +379,70 @@
         </w:rPr>
         <w:t>let me know</w:t>
       </w:r>
-      <w:ins w:id="1" w:author="Spencer Smith" w:date="2026-06-18T22:12:00Z" w16du:dateUtc="2026-06-19T02:12:00Z">
-        <w:r>
-          <w:rPr>
-            <w:rFonts w:ascii="Arial" w:hAnsi="Arial" w:cs="Arial"/>
-            <w:color w:val="000000"/>
-            <w:sz w:val="20"/>
-          </w:rPr>
-          <w:t xml:space="preserve"> </w:t>
-        </w:r>
-      </w:ins>
-      <w:del w:id="2" w:author="Spencer Smith" w:date="2026-06-18T22:12:00Z" w16du:dateUtc="2026-06-19T02:12:00Z">
-        <w:r>
-          <w:rPr>
-            <w:rFonts w:ascii="Arial" w:hAnsi="Arial" w:cs="Arial"/>
-            <w:color w:val="000000"/>
-            <w:sz w:val="20"/>
-          </w:rPr>
-          <w:delText xml:space="preserve"> </w:delText>
-        </w:r>
-        <w:r>
-          <w:rPr>
-            <w:rFonts w:ascii="Arial" w:hAnsi="Arial" w:cs="Arial"/>
-            <w:color w:val="000000"/>
-            <w:sz w:val="20"/>
-          </w:rPr>
-          <w:delText xml:space="preserve">by </w:delText>
-        </w:r>
-        <w:r>
-          <w:rPr>
-            <w:rFonts w:ascii="Arial" w:hAnsi="Arial" w:cs="Arial"/>
-            <w:color w:val="000000"/>
-            <w:sz w:val="20"/>
-          </w:rPr>
-          <w:delText xml:space="preserve">that I have your consent </w:delText>
-        </w:r>
-        <w:r>
-          <w:rPr>
-            <w:rFonts w:ascii="Arial" w:hAnsi="Arial" w:cs="Arial"/>
-            <w:color w:val="000000"/>
-            <w:sz w:val="20"/>
-          </w:rPr>
-          <w:delText>by responding to this email</w:delText>
-        </w:r>
-      </w:del>
-      <w:ins w:id="3" w:author="Spencer Smith" w:date="2026-06-18T22:12:00Z" w16du:dateUtc="2026-06-19T02:12:00Z">
-        <w:r>
-          <w:rPr>
-            <w:rFonts w:ascii="Arial" w:hAnsi="Arial" w:cs="Arial"/>
-            <w:color w:val="000000"/>
-            <w:sz w:val="20"/>
-          </w:rPr>
-          <w:t>by responding to this email and stating that you want to participate in</w:t>
-        </w:r>
-        <w:r>
-          <w:rPr>
-            <w:rFonts w:ascii="Arial" w:hAnsi="Arial" w:cs="Arial"/>
-            <w:color w:val="000000"/>
-            <w:sz w:val="20"/>
-          </w:rPr>
-          <w:t xml:space="preserve"> </w:t>
-        </w:r>
-        <w:r>
-          <w:rPr>
-            <w:rFonts w:ascii="Arial" w:hAnsi="Arial" w:cs="Arial"/>
-            <w:color w:val="000000"/>
-            <w:sz w:val="20"/>
-          </w:rPr>
-          <w:t>the study. Also, if you have any questions</w:t>
-        </w:r>
-        <w:r>
-          <w:rPr>
-            <w:rFonts w:ascii="Arial" w:hAnsi="Arial" w:cs="Arial"/>
-            <w:color w:val="000000"/>
-            <w:sz w:val="20"/>
-          </w:rPr>
-          <w:t xml:space="preserve"> that</w:t>
-        </w:r>
-        <w:r>
-          <w:rPr>
-            <w:rFonts w:ascii="Arial" w:hAnsi="Arial" w:cs="Arial"/>
-            <w:color w:val="000000"/>
-            <w:sz w:val="20"/>
-          </w:rPr>
-          <w:t xml:space="preserve"> you wanted answered before deciding</w:t>
-        </w:r>
-        <w:r>
-          <w:rPr>
-            <w:rFonts w:ascii="Arial" w:hAnsi="Arial" w:cs="Arial"/>
-            <w:color w:val="000000"/>
-            <w:sz w:val="20"/>
-          </w:rPr>
-          <w:t xml:space="preserve"> </w:t>
-        </w:r>
-        <w:r>
-          <w:rPr>
-            <w:rFonts w:ascii="Arial" w:hAnsi="Arial" w:cs="Arial"/>
-            <w:color w:val="000000"/>
-            <w:sz w:val="20"/>
-          </w:rPr>
-          <w:t>to participate, please let us know</w:t>
-        </w:r>
-      </w:ins>
+      <w:r>
+        <w:rPr>
+          <w:rFonts w:ascii="Arial" w:hAnsi="Arial" w:cs="Arial"/>
+          <w:color w:val="000000"/>
+          <w:sz w:val="20"/>
+        </w:rPr>
+        <w:t xml:space="preserve"> </w:t>
+      </w:r>
+      <w:r>
+        <w:rPr>
+          <w:rFonts w:ascii="Arial" w:hAnsi="Arial" w:cs="Arial"/>
+          <w:color w:val="000000"/>
+          <w:sz w:val="20"/>
+        </w:rPr>
+        <w:t>by responding to this email and stating that you want to participate in</w:t>
+      </w:r>
+      <w:r>
+        <w:rPr>
+          <w:rFonts w:ascii="Arial" w:hAnsi="Arial" w:cs="Arial"/>
+          <w:color w:val="000000"/>
+          <w:sz w:val="20"/>
+        </w:rPr>
+        <w:t xml:space="preserve"> </w:t>
+      </w:r>
+      <w:r>
+        <w:rPr>
+          <w:rFonts w:ascii="Arial" w:hAnsi="Arial" w:cs="Arial"/>
+          <w:color w:val="000000"/>
+          <w:sz w:val="20"/>
+        </w:rPr>
+        <w:t>the study. Also, if you have any questions</w:t>
+      </w:r>
+      <w:r>
+        <w:rPr>
+          <w:rFonts w:ascii="Arial" w:hAnsi="Arial" w:cs="Arial"/>
+          <w:color w:val="000000"/>
+          <w:sz w:val="20"/>
+        </w:rPr>
+        <w:t xml:space="preserve"> that</w:t>
+      </w:r>
+      <w:r>
+        <w:rPr>
+          <w:rFonts w:ascii="Arial" w:hAnsi="Arial" w:cs="Arial"/>
+          <w:color w:val="000000"/>
+          <w:sz w:val="20"/>
+        </w:rPr>
+        <w:t xml:space="preserve"> you wanted answered before deciding</w:t>
+      </w:r>
+      <w:r>
+        <w:rPr>
+          <w:rFonts w:ascii="Arial" w:hAnsi="Arial" w:cs="Arial"/>
+          <w:color w:val="000000"/>
+          <w:sz w:val="20"/>
+        </w:rPr>
+        <w:t xml:space="preserve"> </w:t>
+      </w:r>
+      <w:r>
+        <w:rPr>
+          <w:rFonts w:ascii="Arial" w:hAnsi="Arial" w:cs="Arial"/>
+          <w:color w:val="000000"/>
+          <w:sz w:val="20"/>
+        </w:rPr>
+        <w:t>to participate, please let us know</w:t>
+      </w:r>
       <w:r>
         <w:rPr>
           <w:rFonts w:ascii="Arial" w:hAnsi="Arial" w:cs="Arial"/>
@@ -1582,14 +1538,6 @@
     <w:abstractNumId w:val="0"/>
   </w:num>
 </w:numbering>
-</file>
-
-<file path=word/people.xml><?xml version="1.0" encoding="utf-8"?>
-<w15:people xmlns:wpc="http://schemas.microsoft.com/office/word/2010/wordprocessingCanvas" xmlns:cx="http://schemas.microsoft.com/office/drawing/2014/chartex" xmlns:cx1="http://schemas.microsoft.com/office/drawing/2015/9/8/chartex" xmlns:cx2="http://schemas.microsoft.com/office/drawing/2015/10/21/chartex" xmlns:cx3="http://schemas.microsoft.com/office/drawing/2016/5/9/chartex" xmlns:cx4="http://schemas.microsoft.com/office/drawing/2016/5/10/chartex" xmlns:cx5="http://schemas.microsoft.com/office/drawing/2016/5/11/chartex" xmlns:cx6="http://schemas.microsoft.com/office/drawing/2016/5/12/chartex" xmlns:cx7="http://schemas.microsoft.com/office/drawing/2016/5/13/chartex" xmlns:cx8="http://schemas.microsoft.com/office/drawing/2016/5/14/chartex" xmlns:mc="http://schemas.openxmlformats.org/markup-compatibility/2006" xmlns:m="http://schemas.openxmlformats.org/officeDocument/2006/math" xmlns:aink="http://schemas.microsoft.com/office/drawing/2016/ink" xmlns:am3d="http://schemas.microsoft.com/office/drawing/2017/model3d" xmlns:oel="http://schemas.microsoft.com/office/2019/extlst" xmlns:r="http://schemas.openxmlformats.org/officeDocument/2006/relationships" xmlns:wp14="http://schemas.microsoft.com/office/word/2010/wordprocessingDrawing" xmlns:wp="http://schemas.openxmlformats.org/drawingml/2006/wordprocessingDrawing" xmlns:wpg="http://schemas.microsoft.com/office/word/2010/wordprocessingGroup" xmlns:wpi="http://schemas.microsoft.com/office/word/2010/wordprocessingInk" xmlns:wps="http://schemas.microsoft.com/office/word/2010/wordprocessingShape" xmlns:o="urn:schemas-microsoft-com:office:office" xmlns:v="urn:schemas-microsoft-com:vml" xmlns:w10="urn:schemas-microsoft-com:office:word" xmlns:w="http://schemas.openxmlformats.org/wordprocessingml/2006/main" xmlns:w14="http://schemas.microsoft.com/office/word/2010/wordml" xmlns:w15="http://schemas.microsoft.com/office/word/2012/wordml" xmlns:w16cex="http://schemas.microsoft.com/office/word/2018/wordml/cex" xmlns:w16cid="http://schemas.microsoft.com/office/word/2016/wordml/cid" xmlns:w16="http://schemas.microsoft.com/office/word/2018/wordml" xmlns:w16sdtdh="http://schemas.microsoft.com/office/word/2020/wordml/sdtdatahash" xmlns:w16sdtfl="http://schemas.microsoft.com/office/word/2024/wordml/sdtformatlock" xmlns:w16se="http://schemas.microsoft.com/office/word/2015/wordml/symex" xmlns:w16du="http://schemas.microsoft.com/office/word/2023/wordml/word16du" xmlns:wne="http://schemas.microsoft.com/office/word/2006/wordml" mc:Ignorable="w14 w15 w16se w16cid w16 w16cex w16sdtdh w16sdtfl w16du wp14">
-  <w15:person w15:author="Spencer Smith">
-    <w15:presenceInfo w15:providerId="AD" w15:userId="S::smiths@mcmaster.ca::80185a1f-9ef1-4a10-a8cf-0d62d99a8080"/>
-  </w15:person>
-</w15:people>
 </file>
 
 <file path=word/styles.xml><?xml version="1.0" encoding="utf-8"?>

</xml_diff>